<commit_message>
a couple off acitivity fixes
</commit_message>
<xml_diff>
--- a/docs/3-activities/instructions/06.1-activity-color-interference.docx
+++ b/docs/3-activities/instructions/06.1-activity-color-interference.docx
@@ -2139,6 +2139,84 @@
         <w:rPr>
           <w:rStyle w:val="CommentTok"/>
         </w:rPr>
+        <w:t xml:space="preserve"># sum to zero constraint</w:t>
+      </w:r>
+      <w:r>
+        <w:br/>
+      </w:r>
+      <w:r>
+        <w:rPr>
+          <w:rStyle w:val="FunctionTok"/>
+        </w:rPr>
+        <w:t xml:space="preserve">options</w:t>
+      </w:r>
+      <w:r>
+        <w:rPr>
+          <w:rStyle w:val="NormalTok"/>
+        </w:rPr>
+        <w:t xml:space="preserve">(</w:t>
+      </w:r>
+      <w:r>
+        <w:rPr>
+          <w:rStyle w:val="AttributeTok"/>
+        </w:rPr>
+        <w:t xml:space="preserve">contrasts =</w:t>
+      </w:r>
+      <w:r>
+        <w:rPr>
+          <w:rStyle w:val="NormalTok"/>
+        </w:rPr>
+        <w:t xml:space="preserve"> </w:t>
+      </w:r>
+      <w:r>
+        <w:rPr>
+          <w:rStyle w:val="FunctionTok"/>
+        </w:rPr>
+        <w:t xml:space="preserve">c</w:t>
+      </w:r>
+      <w:r>
+        <w:rPr>
+          <w:rStyle w:val="NormalTok"/>
+        </w:rPr>
+        <w:t xml:space="preserve">(</w:t>
+      </w:r>
+      <w:r>
+        <w:rPr>
+          <w:rStyle w:val="StringTok"/>
+        </w:rPr>
+        <w:t xml:space="preserve">"contr.sum"</w:t>
+      </w:r>
+      <w:r>
+        <w:rPr>
+          <w:rStyle w:val="NormalTok"/>
+        </w:rPr>
+        <w:t xml:space="preserve">, </w:t>
+      </w:r>
+      <w:r>
+        <w:rPr>
+          <w:rStyle w:val="StringTok"/>
+        </w:rPr>
+        <w:t xml:space="preserve">"contr.poly"</w:t>
+      </w:r>
+      <w:r>
+        <w:rPr>
+          <w:rStyle w:val="NormalTok"/>
+        </w:rPr>
+        <w:t xml:space="preserve">))</w:t>
+      </w:r>
+      <w:r>
+        <w:br/>
+      </w:r>
+      <w:r>
+        <w:br/>
+      </w:r>
+      <w:r>
+        <w:br/>
+      </w:r>
+      <w:r>
+        <w:rPr>
+          <w:rStyle w:val="CommentTok"/>
+        </w:rPr>
         <w:t xml:space="preserve"># fit model</w:t>
       </w:r>
       <w:r>
@@ -2292,13 +2370,13 @@
       </w:r>
     </w:p>
     <w:bookmarkEnd w:id="33"/>
-    <w:bookmarkStart w:id="34" w:name="X8bcd7ca0035d77555c78578215bf279f9dc5a5a"/>
+    <w:bookmarkStart w:id="34" w:name="X8576e275a15bfcbe76c6f796e8281d3d8b14fa9"/>
     <w:p>
       <w:pPr>
         <w:pStyle w:val="Heading3"/>
       </w:pPr>
       <w:r>
-        <w:t xml:space="preserve">9. Compare your results between (3) and (9). What do you notice?</w:t>
+        <w:t xml:space="preserve">9. Compare your results between (3) and (8). What do you notice?</w:t>
       </w:r>
     </w:p>
     <w:bookmarkEnd w:id="34"/>

</xml_diff>

<commit_message>
add picture to instructions
</commit_message>
<xml_diff>
--- a/docs/3-activities/instructions/06.1-activity-color-interference.docx
+++ b/docs/3-activities/instructions/06.1-activity-color-interference.docx
@@ -318,6 +318,53 @@
         <w:pStyle w:val="FirstParagraph"/>
       </w:pPr>
       <w:r>
+        <w:drawing>
+          <wp:inline>
+            <wp:extent cx="3200400" cy="1087337"/>
+            <wp:effectExtent b="0" l="0" r="0" t="0"/>
+            <wp:docPr descr="" title="" id="18" name="Picture"/>
+            <a:graphic>
+              <a:graphicData uri="http://schemas.openxmlformats.org/drawingml/2006/picture">
+                <pic:pic>
+                  <pic:nvPicPr>
+                    <pic:cNvPr descr="https://github.com/earobinson95/stat323-calpoly/blob/main/flipped-style/06-random-and-mixed/images/black-diffcol-texts.png?raw=true" id="19" name="Picture"/>
+                    <pic:cNvPicPr>
+                      <a:picLocks noChangeArrowheads="1" noChangeAspect="1"/>
+                    </pic:cNvPicPr>
+                  </pic:nvPicPr>
+                  <pic:blipFill>
+                    <a:blip r:embed="rId17"/>
+                    <a:stretch>
+                      <a:fillRect/>
+                    </a:stretch>
+                  </pic:blipFill>
+                  <pic:spPr bwMode="auto">
+                    <a:xfrm>
+                      <a:off x="0" y="0"/>
+                      <a:ext cx="3200400" cy="1087337"/>
+                    </a:xfrm>
+                    <a:prstGeom prst="rect">
+                      <a:avLst/>
+                    </a:prstGeom>
+                    <a:noFill/>
+                    <a:ln w="9525">
+                      <a:noFill/>
+                      <a:headEnd/>
+                      <a:tailEnd/>
+                    </a:ln>
+                  </pic:spPr>
+                </pic:pic>
+              </a:graphicData>
+            </a:graphic>
+          </wp:inline>
+        </w:drawing>
+      </w:r>
+    </w:p>
+    <w:p>
+      <w:pPr>
+        <w:pStyle w:val="BodyText"/>
+      </w:pPr>
+      <w:r>
         <w:t xml:space="preserve">The article reports on the results of a study in which seventy college undergraduates were given forms with 100 names of colors written in black ink, and the same 100 names of colors written in another color (i.e., the word purple written in green ink). The total time (in seconds) for</w:t>
       </w:r>
       <w:r>
@@ -327,7 +374,7 @@
         <w:t xml:space="preserve">reading the 100 words printed in black, and the total time (in seconds) for reading the 100 words printed in different colors were recorded for each subject. The order in which the forms (black or color) were given was randomized to the subjects.</w:t>
       </w:r>
     </w:p>
-    <w:bookmarkStart w:id="19" w:name="part-a-study-data"/>
+    <w:bookmarkStart w:id="22" w:name="part-a-study-data"/>
     <w:p>
       <w:pPr>
         <w:pStyle w:val="Heading2"/>
@@ -336,7 +383,7 @@
         <w:t xml:space="preserve">Part A: Study Data</w:t>
       </w:r>
     </w:p>
-    <w:bookmarkStart w:id="17" w:name="read-in-the-data"/>
+    <w:bookmarkStart w:id="20" w:name="read-in-the-data"/>
     <w:p>
       <w:pPr>
         <w:pStyle w:val="Heading3"/>
@@ -694,8 +741,8 @@
         <w:t xml:space="preserve">(text_color))</w:t>
       </w:r>
     </w:p>
-    <w:bookmarkEnd w:id="17"/>
-    <w:bookmarkStart w:id="18" w:name="take-a-look-at-the-data-in-r"/>
+    <w:bookmarkEnd w:id="20"/>
+    <w:bookmarkStart w:id="21" w:name="take-a-look-at-the-data-in-r"/>
     <w:p>
       <w:pPr>
         <w:pStyle w:val="Heading3"/>
@@ -905,9 +952,9 @@
         <w:t xml:space="preserve">column represent?:</w:t>
       </w:r>
     </w:p>
-    <w:bookmarkEnd w:id="18"/>
-    <w:bookmarkEnd w:id="19"/>
-    <w:bookmarkStart w:id="24" w:name="part-b-paired-t-test"/>
+    <w:bookmarkEnd w:id="21"/>
+    <w:bookmarkEnd w:id="22"/>
+    <w:bookmarkStart w:id="27" w:name="part-b-paired-t-test"/>
     <w:p>
       <w:pPr>
         <w:pStyle w:val="Heading2"/>
@@ -916,7 +963,7 @@
         <w:t xml:space="preserve">Part B: Paired t-test</w:t>
       </w:r>
     </w:p>
-    <w:bookmarkStart w:id="23" w:name="Xf7704204537cd23eefa6f1ecd59fc7af427925c"/>
+    <w:bookmarkStart w:id="26" w:name="Xf7704204537cd23eefa6f1ecd59fc7af427925c"/>
     <w:p>
       <w:pPr>
         <w:pStyle w:val="Heading3"/>
@@ -966,18 +1013,18 @@
                 <wp:inline>
                   <wp:extent cx="152400" cy="152400"/>
                   <wp:effectExtent b="0" l="0" r="0" t="0"/>
-                  <wp:docPr descr="" title="" id="21" name="Picture"/>
+                  <wp:docPr descr="" title="" id="24" name="Picture"/>
                   <a:graphic>
                     <a:graphicData uri="http://schemas.openxmlformats.org/drawingml/2006/picture">
                       <pic:pic>
                         <pic:nvPicPr>
-                          <pic:cNvPr descr="/Applications/quarto/share/formats/docx/note.png" id="22" name="Picture"/>
+                          <pic:cNvPr descr="/Applications/quarto/share/formats/docx/note.png" id="25" name="Picture"/>
                           <pic:cNvPicPr>
                             <a:picLocks noChangeArrowheads="1" noChangeAspect="1"/>
                           </pic:cNvPicPr>
                         </pic:nvPicPr>
                         <pic:blipFill>
-                          <a:blip r:embed="rId20"/>
+                          <a:blip r:embed="rId23"/>
                           <a:stretch>
                             <a:fillRect/>
                           </a:stretch>
@@ -1198,9 +1245,9 @@
         <w:t xml:space="preserve">Estimated standard error of the mean difference in time: _____________________</w:t>
       </w:r>
     </w:p>
-    <w:bookmarkEnd w:id="23"/>
-    <w:bookmarkEnd w:id="24"/>
-    <w:bookmarkStart w:id="27" w:name="part-c-study-design"/>
+    <w:bookmarkEnd w:id="26"/>
+    <w:bookmarkEnd w:id="27"/>
+    <w:bookmarkStart w:id="30" w:name="part-c-study-design"/>
     <w:p>
       <w:pPr>
         <w:pStyle w:val="Heading2"/>
@@ -1209,7 +1256,7 @@
         <w:t xml:space="preserve">Part C: Study Design</w:t>
       </w:r>
     </w:p>
-    <w:bookmarkStart w:id="25" w:name="X0af67a88f4744c4cfe5b3fe1ccb217f53ecb67f"/>
+    <w:bookmarkStart w:id="28" w:name="X0af67a88f4744c4cfe5b3fe1ccb217f53ecb67f"/>
     <w:p>
       <w:pPr>
         <w:pStyle w:val="Heading3"/>
@@ -1251,8 +1298,8 @@
         <w:t xml:space="preserve">Design structure:</w:t>
       </w:r>
     </w:p>
-    <w:bookmarkEnd w:id="25"/>
-    <w:bookmarkStart w:id="26" w:name="Xab13325bda53c23e6aa60fcdea98c55e6767da3"/>
+    <w:bookmarkEnd w:id="28"/>
+    <w:bookmarkStart w:id="29" w:name="Xab13325bda53c23e6aa60fcdea98c55e6767da3"/>
     <w:p>
       <w:pPr>
         <w:pStyle w:val="Heading3"/>
@@ -1261,9 +1308,9 @@
         <w:t xml:space="preserve">5. Why is it important the researchers randomized the order in which the forms (black or different color) were given to subjects?</w:t>
       </w:r>
     </w:p>
-    <w:bookmarkEnd w:id="26"/>
-    <w:bookmarkEnd w:id="27"/>
-    <w:bookmarkStart w:id="35" w:name="part-d-linear-mixed-model"/>
+    <w:bookmarkEnd w:id="29"/>
+    <w:bookmarkEnd w:id="30"/>
+    <w:bookmarkStart w:id="38" w:name="part-d-linear-mixed-model"/>
     <w:p>
       <w:pPr>
         <w:pStyle w:val="Heading2"/>
@@ -1313,18 +1360,18 @@
                 <wp:inline>
                   <wp:extent cx="152400" cy="152400"/>
                   <wp:effectExtent b="0" l="0" r="0" t="0"/>
-                  <wp:docPr descr="" title="" id="29" name="Picture"/>
+                  <wp:docPr descr="" title="" id="32" name="Picture"/>
                   <a:graphic>
                     <a:graphicData uri="http://schemas.openxmlformats.org/drawingml/2006/picture">
                       <pic:pic>
                         <pic:nvPicPr>
-                          <pic:cNvPr descr="/Applications/quarto/share/formats/docx/tip.png" id="30" name="Picture"/>
+                          <pic:cNvPr descr="/Applications/quarto/share/formats/docx/tip.png" id="33" name="Picture"/>
                           <pic:cNvPicPr>
                             <a:picLocks noChangeArrowheads="1" noChangeAspect="1"/>
                           </pic:cNvPicPr>
                         </pic:nvPicPr>
                         <pic:blipFill>
-                          <a:blip r:embed="rId28"/>
+                          <a:blip r:embed="rId31"/>
                           <a:stretch>
                             <a:fillRect/>
                           </a:stretch>
@@ -1419,7 +1466,7 @@
         </w:tc>
       </w:tr>
     </w:tbl>
-    <w:bookmarkStart w:id="31" w:name="X0c303b67c39e92ebb82980ba94ea2481ca66c80"/>
+    <w:bookmarkStart w:id="34" w:name="X0c303b67c39e92ebb82980ba94ea2481ca66c80"/>
     <w:p>
       <w:pPr>
         <w:pStyle w:val="Heading3"/>
@@ -1887,8 +1934,8 @@
         <w:t xml:space="preserve">is the…</w:t>
       </w:r>
     </w:p>
-    <w:bookmarkEnd w:id="31"/>
-    <w:bookmarkStart w:id="32" w:name="X5cb3e9456bb6e17a5754dd2fc05b5d6d873b50a"/>
+    <w:bookmarkEnd w:id="34"/>
+    <w:bookmarkStart w:id="35" w:name="X5cb3e9456bb6e17a5754dd2fc05b5d6d873b50a"/>
     <w:p>
       <w:pPr>
         <w:pStyle w:val="Heading3"/>
@@ -2109,8 +2156,8 @@
         </w:tc>
       </w:tr>
     </w:tbl>
-    <w:bookmarkEnd w:id="32"/>
-    <w:bookmarkStart w:id="33" w:name="Xfbcc813a441d48239b8739728359586b49895c8"/>
+    <w:bookmarkEnd w:id="35"/>
+    <w:bookmarkStart w:id="36" w:name="Xfbcc813a441d48239b8739728359586b49895c8"/>
     <w:p>
       <w:pPr>
         <w:pStyle w:val="Heading3"/>
@@ -2369,8 +2416,8 @@
         <w:t xml:space="preserve">Estimated standard error in the difference in mean time between black and colored text (i.e., ordered difference report/pairs): _____________</w:t>
       </w:r>
     </w:p>
-    <w:bookmarkEnd w:id="33"/>
-    <w:bookmarkStart w:id="34" w:name="X8576e275a15bfcbe76c6f796e8281d3d8b14fa9"/>
+    <w:bookmarkEnd w:id="36"/>
+    <w:bookmarkStart w:id="37" w:name="X8576e275a15bfcbe76c6f796e8281d3d8b14fa9"/>
     <w:p>
       <w:pPr>
         <w:pStyle w:val="Heading3"/>
@@ -2379,8 +2426,8 @@
         <w:t xml:space="preserve">9. Compare your results between (3) and (8). What do you notice?</w:t>
       </w:r>
     </w:p>
-    <w:bookmarkEnd w:id="34"/>
-    <w:bookmarkEnd w:id="35"/>
+    <w:bookmarkEnd w:id="37"/>
+    <w:bookmarkEnd w:id="38"/>
     <w:sectPr>
       <w:footnotePr>
         <w:numRestart w:val="eachSect"/>

</xml_diff>